<commit_message>
Đợt 2: bài học kiểu Sydexa, video mở đầu, bảng dữ liệu SQL, bỏ ghi chú
- Trình học bài: mục lục bên trái (tìm bài, chương thu gọn, ổ khóa), bài chia
  "Phần" + Lộ trình bài học, thanh chấm theo Phần, thẻ "Bài tiếp theo"
- Quiz kiểu Sydexa: từng câu A–D, chấm từng câu ở máy chủ; 3 kiểu Quiz nhanh,
  Dự đoán trước khi xem, Kiểm tra kiến thức
- Video mở đầu cho mỗi bài (YouTube/MP4), 27 video mẫu (docs/video-mau.md)
- Ô code SQL và SQL Playground hiện bảng dữ liệu (cột, kiểu, khóa chính),
  tô sáng dòng thêm/sửa, đếm dòng xóa sau khi chạy; xem trước ở trình soạn
- Danh mục có tab chủ đề + thời lượng; URL bài học dạng slug
- Chế độ sáng/tối; nút "Sao chép mã"
- Bỏ tính năng ghi chú (migration xóa bảng notes)
- Sửa lỗi đăng xuất không cập nhật giao diện

Co-Authored-By: Claude Opus 5.5 <noreply@anthropic.com>
</commit_message>
<xml_diff>
--- a/docs/bao-cao-chuong-1.docx
+++ b/docs/bao-cao-chuong-1.docx
@@ -167,7 +167,7 @@
         <w:jc w:val="both"/>
       </w:pPr>
       <w:r>
-        <w:t xml:space="preserve">Hỗ trợ ghi chú gắn với khối nội dung hoặc mốc thời gian video; ôn tập flashcard theo thuật toán lặp lại ngắt quãng SM-2.</w:t>
+        <w:t xml:space="preserve">Hỗ trợ ôn tập flashcard theo thuật toán lặp lại ngắt quãng SM-2.</w:t>
       </w:r>
     </w:p>
     <w:p>
@@ -3127,7 +3127,7 @@
                 <w:sz w:val="24"/>
                 <w:szCs w:val="24"/>
               </w:rPr>
-              <w:t xml:space="preserve">Tìm kiếm, lọc, đăng ký khóa học; trình học bài đủ loại khối; tiến độ; ghi chú; demo lần 1</w:t>
+              <w:t xml:space="preserve">Tìm kiếm, lọc, đăng ký khóa học; trình học bài đủ loại khối; tiến độ; demo lần 1</w:t>
             </w:r>
           </w:p>
         </w:tc>

</xml_diff>